<commit_message>
refactor: batasi ruang lingkup IOM No. 004 khusus Tim Sales Marketing (tanpa agent freelance/rekanan)
</commit_message>
<xml_diff>
--- a/01_GREN_PROPERTYKOST/03_Internal_Office_Memo_IOM/004_MKT_KAB_GREN_IX_2026_IOM_Skema_Fee_Rukost_Cash_Keras_10_Persen.docx
+++ b/01_GREN_PROPERTYKOST/03_Internal_Office_Memo_IOM/004_MKT_KAB_GREN_IX_2026_IOM_Skema_Fee_Rukost_Cash_Keras_10_Persen.docx
@@ -111,7 +111,7 @@
                 <w:b/>
                 <w:sz w:val="20"/>
               </w:rPr>
-              <w:t>Seluruh Rekan Sales &amp; Agent (All Team) GREN Propertykost</w:t>
+              <w:t>Seluruh Rekan Tim Sales &amp; Marketing GREN Propertykost</w:t>
             </w:r>
           </w:p>
         </w:tc>
@@ -356,7 +356,7 @@
         <w:rPr>
           <w:sz w:val="21"/>
         </w:rPr>
-        <w:t>Sehubungan dengan arahan langsung manajemen dan komitmen perusahaan untuk memberikan apresiasi maksimal bagi rekan-rekan lapangan, bersama ini kami sampaikan kebijakan terbaru mengenai pemberlakuan kembali Skema Fee Penjualan Rukost Tapak 3 Lantai GREN Propertykost Jatinangor dengan ketentuan sebagai berikut:</w:t>
+        <w:t>Sehubungan dengan arahan langsung manajemen dan komitmen perusahaan untuk memberikan apresiasi maksimal bagi rekan-rekan sales marketing, bersama ini kami sampaikan kebijakan terbaru mengenai pemberlakuan kembali Skema Fee Penjualan Rukost Tapak 3 Lantai GREN Propertykost Jatinangor dengan ketentuan sebagai berikut:</w:t>
       </w:r>
     </w:p>
     <w:p>
@@ -369,7 +369,7 @@
           <w:color w:val="1B365D"/>
           <w:sz w:val="21"/>
         </w:rPr>
-        <w:t>1. Skema Fee Penjualan Menjadi 10% untuk All Team</w:t>
+        <w:t>1. Skema Fee Penjualan Menjadi 10% untuk Rekan Sales Marketing</w:t>
       </w:r>
     </w:p>
     <w:p>
@@ -381,7 +381,7 @@
         <w:rPr>
           <w:sz w:val="21"/>
         </w:rPr>
-        <w:t>Fee penjualan unit rukost resmi diberlakukan kembali menjadi 10% (Sepuluh Persen) untuk All Team (seluruh jajaran Sales Internal, Sales Freelance, dan Agent Rekanan) yang berhasil merealisasikan penjualan unit.</w:t>
+        <w:t>Fee penjualan unit rukost resmi diberlakukan kembali menjadi 10% (Sepuluh Persen) khusus bagi rekan-rekan Tim Sales &amp; Marketing yang berhasil merealisasikan penjualan unit.</w:t>
       </w:r>
     </w:p>
     <w:p>
@@ -481,7 +481,7 @@
         <w:rPr>
           <w:sz w:val="21"/>
         </w:rPr>
-        <w:t>Pihak manajemen menghimbau seluruh rekan sales dan leader untuk segera merapatkan barisan, bergerak cepat mem-follow up calon buyer prospektif, serta memanfaatkan momentum golden period 21 hari ini secara maksimal guna mendongkrak pencapaian closing unit bersama.</w:t>
+        <w:t>Pihak manajemen menghimbau seluruh rekan sales marketing untuk segera merapatkan barisan, bergerak cepat mem-follow up calon buyer prospektif, serta memanfaatkan momentum golden period 21 hari ini secara maksimal guna mendongkrak pencapaian closing unit bersama.</w:t>
       </w:r>
     </w:p>
     <w:p>

</xml_diff>

<commit_message>
feat: format ulang IOM No. 004 muat pas 1 lembar A4, bahasa ringkas lugas, dan klausul masa berlaku fleksibel
</commit_message>
<xml_diff>
--- a/01_GREN_PROPERTYKOST/03_Internal_Office_Memo_IOM/004_MKT_KAB_GREN_IX_2026_IOM_Skema_Fee_Rukost_Cash_Keras_10_Persen.docx
+++ b/01_GREN_PROPERTYKOST/03_Internal_Office_Memo_IOM/004_MKT_KAB_GREN_IX_2026_IOM_Skema_Fee_Rukost_Cash_Keras_10_Persen.docx
@@ -2,6 +2,20 @@
 <file path=word/document.xml><?xml version="1.0" encoding="utf-8"?>
 <w:document xmlns:wpc="http://schemas.microsoft.com/office/word/2010/wordprocessingCanvas" xmlns:mo="http://schemas.microsoft.com/office/mac/office/2008/main" xmlns:mc="http://schemas.openxmlformats.org/markup-compatibility/2006" xmlns:mv="urn:schemas-microsoft-com:mac:vml" xmlns:o="urn:schemas-microsoft-com:office:office" xmlns:r="http://schemas.openxmlformats.org/officeDocument/2006/relationships" xmlns:m="http://schemas.openxmlformats.org/officeDocument/2006/math" xmlns:v="urn:schemas-microsoft-com:vml" xmlns:wp14="http://schemas.microsoft.com/office/word/2010/wordprocessingDrawing" xmlns:wp="http://schemas.openxmlformats.org/drawingml/2006/wordprocessingDrawing" xmlns:w10="urn:schemas-microsoft-com:office:word" xmlns:w="http://schemas.openxmlformats.org/wordprocessingml/2006/main" xmlns:w14="http://schemas.microsoft.com/office/word/2010/wordml" xmlns:wpg="http://schemas.microsoft.com/office/word/2010/wordprocessingGroup" xmlns:wpi="http://schemas.microsoft.com/office/word/2010/wordprocessingInk" xmlns:wne="http://schemas.microsoft.com/office/word/2006/wordml" xmlns:wps="http://schemas.microsoft.com/office/word/2010/wordprocessingShape" mc:Ignorable="w14 wp14">
   <w:body>
+    <w:p>
+      <w:pPr>
+        <w:spacing w:before="0" w:after="20"/>
+        <w:jc w:val="center"/>
+      </w:pPr>
+      <w:r>
+        <w:rPr>
+          <w:b/>
+          <w:color w:val="1B365D"/>
+          <w:sz w:val="26"/>
+        </w:rPr>
+        <w:t>INTERNAL OFFICE MEMO</w:t>
+      </w:r>
+    </w:p>
     <w:p>
       <w:pPr>
         <w:spacing w:after="40"/>
@@ -10,44 +24,30 @@
       <w:r>
         <w:rPr>
           <w:b/>
-          <w:color w:val="1B365D"/>
-          <w:sz w:val="28"/>
-        </w:rPr>
-        <w:t>INTERNAL OFFICE MEMO</w:t>
-      </w:r>
-    </w:p>
-    <w:p>
-      <w:pPr>
-        <w:spacing w:after="80"/>
-        <w:jc w:val="center"/>
-      </w:pPr>
-      <w:r>
-        <w:rPr>
-          <w:b/>
-          <w:sz w:val="24"/>
+          <w:sz w:val="22"/>
         </w:rPr>
         <w:t>PT. KENZO ANATHA BUMI</w:t>
       </w:r>
     </w:p>
     <w:p>
       <w:pPr>
-        <w:spacing w:after="280"/>
+        <w:spacing w:after="120"/>
         <w:jc w:val="center"/>
       </w:pPr>
       <w:r>
         <w:rPr>
           <w:b/>
           <w:color w:val="0D5C75"/>
-          <w:sz w:val="22"/>
+          <w:sz w:val="21"/>
         </w:rPr>
         <w:t>No. 004/MKT/KAB/GREN/IX/2026</w:t>
       </w:r>
     </w:p>
     <w:p>
       <w:pPr>
-        <w:spacing w:after="200"/>
+        <w:spacing w:before="0" w:after="120"/>
         <w:pBdr>
-          <w:bottom w:val="single" w:sz="18" w:space="1" w:color="1B365D"/>
+          <w:bottom w:val="single" w:sz="14" w:space="1" w:color="1B365D"/>
         </w:pBdr>
       </w:pPr>
     </w:p>
@@ -59,23 +59,23 @@
         <w:tblLook w:firstColumn="1" w:firstRow="1" w:lastColumn="0" w:lastRow="0" w:noHBand="0" w:noVBand="1" w:val="04A0"/>
       </w:tblPr>
       <w:tblGrid>
-        <w:gridCol w:w="3120"/>
-        <w:gridCol w:w="3120"/>
-        <w:gridCol w:w="3120"/>
+        <w:gridCol w:w="3202"/>
+        <w:gridCol w:w="3202"/>
+        <w:gridCol w:w="3202"/>
       </w:tblGrid>
       <w:tr>
         <w:tc>
           <w:tcPr>
-            <w:tcW w:type="dxa" w:w="2160"/>
+            <w:tcW w:type="dxa" w:w="1872"/>
           </w:tcPr>
           <w:p>
             <w:pPr>
-              <w:spacing w:after="60"/>
+              <w:spacing w:after="30"/>
             </w:pPr>
             <w:r>
               <w:rPr>
                 <w:b/>
-                <w:sz w:val="20"/>
+                <w:sz w:val="19"/>
               </w:rPr>
               <w:t>Kepada Yth</w:t>
             </w:r>
@@ -87,12 +87,12 @@
           </w:tcPr>
           <w:p>
             <w:pPr>
-              <w:spacing w:after="60"/>
+              <w:spacing w:after="30"/>
             </w:pPr>
             <w:r>
               <w:rPr>
                 <w:b/>
-                <w:sz w:val="20"/>
+                <w:sz w:val="19"/>
               </w:rPr>
               <w:t>:</w:t>
             </w:r>
@@ -100,18 +100,18 @@
         </w:tc>
         <w:tc>
           <w:tcPr>
-            <w:tcW w:type="dxa" w:w="6912"/>
+            <w:tcW w:type="dxa" w:w="7344"/>
           </w:tcPr>
           <w:p>
             <w:pPr>
-              <w:spacing w:after="60"/>
+              <w:spacing w:after="30"/>
             </w:pPr>
             <w:r>
               <w:rPr>
                 <w:b/>
-                <w:sz w:val="20"/>
+                <w:sz w:val="19"/>
               </w:rPr>
-              <w:t>Seluruh Rekan Tim Sales &amp; Marketing GREN Propertykost</w:t>
+              <w:t>Rekan-rekan Tim Sales &amp; Marketing GREN Propertykost</w:t>
             </w:r>
           </w:p>
         </w:tc>
@@ -119,16 +119,16 @@
       <w:tr>
         <w:tc>
           <w:tcPr>
-            <w:tcW w:type="dxa" w:w="2160"/>
+            <w:tcW w:type="dxa" w:w="1872"/>
           </w:tcPr>
           <w:p>
             <w:pPr>
-              <w:spacing w:after="60"/>
+              <w:spacing w:after="30"/>
             </w:pPr>
             <w:r>
               <w:rPr>
                 <w:b/>
-                <w:sz w:val="20"/>
+                <w:sz w:val="19"/>
               </w:rPr>
               <w:t>Dari</w:t>
             </w:r>
@@ -140,12 +140,12 @@
           </w:tcPr>
           <w:p>
             <w:pPr>
-              <w:spacing w:after="60"/>
+              <w:spacing w:after="30"/>
             </w:pPr>
             <w:r>
               <w:rPr>
                 <w:b/>
-                <w:sz w:val="20"/>
+                <w:sz w:val="19"/>
               </w:rPr>
               <w:t>:</w:t>
             </w:r>
@@ -153,16 +153,16 @@
         </w:tc>
         <w:tc>
           <w:tcPr>
-            <w:tcW w:type="dxa" w:w="6912"/>
+            <w:tcW w:type="dxa" w:w="7344"/>
           </w:tcPr>
           <w:p>
             <w:pPr>
-              <w:spacing w:after="60"/>
+              <w:spacing w:after="30"/>
             </w:pPr>
             <w:r>
               <w:rPr>
                 <w:b w:val="0"/>
-                <w:sz w:val="20"/>
+                <w:sz w:val="19"/>
               </w:rPr>
               <w:t>Divisi Marketing Communication &amp; Digital</w:t>
             </w:r>
@@ -172,16 +172,16 @@
       <w:tr>
         <w:tc>
           <w:tcPr>
-            <w:tcW w:type="dxa" w:w="2160"/>
+            <w:tcW w:type="dxa" w:w="1872"/>
           </w:tcPr>
           <w:p>
             <w:pPr>
-              <w:spacing w:after="60"/>
+              <w:spacing w:after="30"/>
             </w:pPr>
             <w:r>
               <w:rPr>
                 <w:b/>
-                <w:sz w:val="20"/>
+                <w:sz w:val="19"/>
               </w:rPr>
               <w:t>Tembusan</w:t>
             </w:r>
@@ -193,12 +193,12 @@
           </w:tcPr>
           <w:p>
             <w:pPr>
-              <w:spacing w:after="60"/>
+              <w:spacing w:after="30"/>
             </w:pPr>
             <w:r>
               <w:rPr>
                 <w:b/>
-                <w:sz w:val="20"/>
+                <w:sz w:val="19"/>
               </w:rPr>
               <w:t>:</w:t>
             </w:r>
@@ -206,16 +206,16 @@
         </w:tc>
         <w:tc>
           <w:tcPr>
-            <w:tcW w:type="dxa" w:w="6912"/>
+            <w:tcW w:type="dxa" w:w="7344"/>
           </w:tcPr>
           <w:p>
             <w:pPr>
-              <w:spacing w:after="60"/>
+              <w:spacing w:after="30"/>
             </w:pPr>
             <w:r>
               <w:rPr>
                 <w:b w:val="0"/>
-                <w:sz w:val="20"/>
+                <w:sz w:val="19"/>
               </w:rPr>
               <w:t>Bapak Yana Priatna (Direktur Utama / CEO &amp; Founder)</w:t>
             </w:r>
@@ -225,16 +225,16 @@
       <w:tr>
         <w:tc>
           <w:tcPr>
-            <w:tcW w:type="dxa" w:w="2160"/>
+            <w:tcW w:type="dxa" w:w="1872"/>
           </w:tcPr>
           <w:p>
             <w:pPr>
-              <w:spacing w:after="60"/>
+              <w:spacing w:after="30"/>
             </w:pPr>
             <w:r>
               <w:rPr>
                 <w:b/>
-                <w:sz w:val="20"/>
+                <w:sz w:val="19"/>
               </w:rPr>
               <w:t>Tanggal</w:t>
             </w:r>
@@ -246,12 +246,12 @@
           </w:tcPr>
           <w:p>
             <w:pPr>
-              <w:spacing w:after="60"/>
+              <w:spacing w:after="30"/>
             </w:pPr>
             <w:r>
               <w:rPr>
                 <w:b/>
-                <w:sz w:val="20"/>
+                <w:sz w:val="19"/>
               </w:rPr>
               <w:t>:</w:t>
             </w:r>
@@ -259,16 +259,16 @@
         </w:tc>
         <w:tc>
           <w:tcPr>
-            <w:tcW w:type="dxa" w:w="6912"/>
+            <w:tcW w:type="dxa" w:w="7344"/>
           </w:tcPr>
           <w:p>
             <w:pPr>
-              <w:spacing w:after="60"/>
+              <w:spacing w:after="30"/>
             </w:pPr>
             <w:r>
               <w:rPr>
                 <w:b w:val="0"/>
-                <w:sz w:val="20"/>
+                <w:sz w:val="19"/>
               </w:rPr>
               <w:t>21 September 2026</w:t>
             </w:r>
@@ -278,16 +278,16 @@
       <w:tr>
         <w:tc>
           <w:tcPr>
-            <w:tcW w:type="dxa" w:w="2160"/>
+            <w:tcW w:type="dxa" w:w="1872"/>
           </w:tcPr>
           <w:p>
             <w:pPr>
-              <w:spacing w:after="60"/>
+              <w:spacing w:after="30"/>
             </w:pPr>
             <w:r>
               <w:rPr>
                 <w:b/>
-                <w:sz w:val="20"/>
+                <w:sz w:val="19"/>
               </w:rPr>
               <w:t>Perihal</w:t>
             </w:r>
@@ -299,12 +299,12 @@
           </w:tcPr>
           <w:p>
             <w:pPr>
-              <w:spacing w:after="60"/>
+              <w:spacing w:after="30"/>
             </w:pPr>
             <w:r>
               <w:rPr>
                 <w:b/>
-                <w:sz w:val="20"/>
+                <w:sz w:val="19"/>
               </w:rPr>
               <w:t>:</w:t>
             </w:r>
@@ -312,18 +312,18 @@
         </w:tc>
         <w:tc>
           <w:tcPr>
-            <w:tcW w:type="dxa" w:w="6912"/>
+            <w:tcW w:type="dxa" w:w="7344"/>
           </w:tcPr>
           <w:p>
             <w:pPr>
-              <w:spacing w:after="60"/>
+              <w:spacing w:after="30"/>
             </w:pPr>
             <w:r>
               <w:rPr>
                 <w:b/>
-                <w:sz w:val="20"/>
+                <w:sz w:val="19"/>
               </w:rPr>
-              <w:t>Kebijakan Skema Fee Penjualan Rukost 10% Khusus Cash Keras (Masa Berlaku 21 Hari)</w:t>
+              <w:t>Kebijakan Fee Penjualan Rukost 10% (Khusus Cash Keras 21 Hari)</w:t>
             </w:r>
           </w:p>
         </w:tc>
@@ -331,7 +331,7 @@
     </w:tbl>
     <w:p>
       <w:pPr>
-        <w:spacing w:before="120" w:after="200"/>
+        <w:spacing w:before="60" w:after="120"/>
         <w:pBdr>
           <w:bottom w:val="single" w:sz="6" w:space="1" w:color="CCCCCC"/>
         </w:pBdr>
@@ -339,172 +339,173 @@
     </w:p>
     <w:p>
       <w:pPr>
-        <w:spacing w:after="120"/>
+        <w:spacing w:after="60"/>
       </w:pPr>
       <w:r>
         <w:rPr>
-          <w:sz w:val="21"/>
+          <w:sz w:val="20"/>
         </w:rPr>
         <w:t>Dengan Hormat,</w:t>
       </w:r>
     </w:p>
     <w:p>
       <w:pPr>
-        <w:spacing w:after="160"/>
+        <w:spacing w:after="120"/>
       </w:pPr>
       <w:r>
         <w:rPr>
-          <w:sz w:val="21"/>
+          <w:sz w:val="20"/>
         </w:rPr>
-        <w:t>Sehubungan dengan arahan langsung manajemen dan komitmen perusahaan untuk memberikan apresiasi maksimal bagi rekan-rekan sales marketing, bersama ini kami sampaikan kebijakan terbaru mengenai pemberlakuan kembali Skema Fee Penjualan Rukost Tapak 3 Lantai GREN Propertykost Jatinangor dengan ketentuan sebagai berikut:</w:t>
+        <w:t>Menindaklanjuti arahan langsung dari pimpinan manajemen untuk percepatan penjualan unit Rukost GREN Propertykost Jatinangor, berikut adalah ketentuan kebijakan fee penjualan terbaru yang berlaku untuk tim:</w:t>
       </w:r>
     </w:p>
     <w:p>
       <w:pPr>
-        <w:spacing w:before="80" w:after="40"/>
+        <w:spacing w:before="60" w:after="20"/>
       </w:pPr>
       <w:r>
         <w:rPr>
           <w:b/>
           <w:color w:val="1B365D"/>
-          <w:sz w:val="21"/>
+          <w:sz w:val="19"/>
         </w:rPr>
-        <w:t>1. Skema Fee Penjualan Menjadi 10% untuk Rekan Sales Marketing</w:t>
+        <w:t>1. Fee Rukost Menjadi 10% (Khusus Sales Marketing):</w:t>
       </w:r>
     </w:p>
     <w:p>
       <w:pPr>
-        <w:spacing w:after="120"/>
-        <w:ind w:left="360"/>
+        <w:spacing w:after="80"/>
+        <w:ind w:left="288"/>
       </w:pPr>
       <w:r>
         <w:rPr>
-          <w:sz w:val="21"/>
+          <w:sz w:val="19"/>
         </w:rPr>
-        <w:t>Fee penjualan unit rukost resmi diberlakukan kembali menjadi 10% (Sepuluh Persen) khusus bagi rekan-rekan Tim Sales &amp; Marketing yang berhasil merealisasikan penjualan unit.</w:t>
+        <w:t>Fee penjualan unit rukost resmi diberlakukan kembali menjadi 10% khusus bagi rekan-rekan Tim Sales Marketing internal yang berhasil merealisasikan penjualan unit.</w:t>
       </w:r>
     </w:p>
     <w:p>
       <w:pPr>
-        <w:spacing w:before="80" w:after="40"/>
+        <w:spacing w:before="60" w:after="20"/>
       </w:pPr>
       <w:r>
         <w:rPr>
           <w:b/>
           <w:color w:val="1B365D"/>
-          <w:sz w:val="21"/>
+          <w:sz w:val="19"/>
         </w:rPr>
-        <w:t>2. Khusus Pembelian Skema Cash Keras</w:t>
+        <w:t>2. Hanya untuk Skema Bayar Cash Keras:</w:t>
       </w:r>
     </w:p>
     <w:p>
       <w:pPr>
-        <w:spacing w:after="120"/>
-        <w:ind w:left="360"/>
+        <w:spacing w:after="80"/>
+        <w:ind w:left="288"/>
       </w:pPr>
       <w:r>
         <w:rPr>
-          <w:sz w:val="21"/>
+          <w:sz w:val="19"/>
         </w:rPr>
-        <w:t>Pemberlakuan fee 10% ini berlaku secara spesifik hanya untuk transaksi pembelian unit dengan skema pembayaran Cash Keras.</w:t>
+        <w:t>Ketentuan fee 10% ini hanya berlaku khusus untuk transaksi pembelian konsumen dengan cara pembayaran Cash Keras.</w:t>
       </w:r>
     </w:p>
     <w:p>
       <w:pPr>
-        <w:spacing w:before="80" w:after="40"/>
+        <w:spacing w:before="60" w:after="20"/>
       </w:pPr>
       <w:r>
         <w:rPr>
           <w:b/>
           <w:color w:val="1B365D"/>
-          <w:sz w:val="21"/>
+          <w:sz w:val="19"/>
         </w:rPr>
-        <w:t>3. Masa Berlaku Golden Period: Maksimal 21 Hari (3 Minggu)</w:t>
+        <w:t>3. Batas Waktu 21 Hari (3 Minggu) dari Reservasi:</w:t>
       </w:r>
     </w:p>
     <w:p>
       <w:pPr>
-        <w:spacing w:after="120"/>
-        <w:ind w:left="360"/>
+        <w:spacing w:after="80"/>
+        <w:ind w:left="288"/>
       </w:pPr>
       <w:r>
         <w:rPr>
-          <w:sz w:val="21"/>
+          <w:sz w:val="19"/>
         </w:rPr>
-        <w:t>Kebijakan fee 10% Cash Keras ini hanya berlaku terbatas selama 21 (Dua Puluh Satu) Hari Kalender atau 3 (Tiga) Minggu terhitung sejak tanggal diterbitkannya tanda terima Reservasi / Booking Fee konsumen.</w:t>
+        <w:t>Skema harga cash keras dan fee 10% ini berlaku maksimal 21 hari (3 minggu) saja, terhitung sejak konsumen melakukan reservasi / booking fee.</w:t>
       </w:r>
     </w:p>
     <w:p>
       <w:pPr>
-        <w:spacing w:before="80" w:after="40"/>
+        <w:spacing w:before="60" w:after="20"/>
       </w:pPr>
       <w:r>
         <w:rPr>
           <w:b/>
           <w:color w:val="1B365D"/>
-          <w:sz w:val="21"/>
+          <w:sz w:val="19"/>
         </w:rPr>
-        <w:t>4. Ketentuan Melewati Batas Waktu 21 Hari</w:t>
+        <w:t>4. Ketentuan Lewat dari 3 Minggu:</w:t>
       </w:r>
     </w:p>
     <w:p>
       <w:pPr>
-        <w:spacing w:after="120"/>
-        <w:ind w:left="360"/>
+        <w:spacing w:after="80"/>
+        <w:ind w:left="288"/>
       </w:pPr>
       <w:r>
         <w:rPr>
-          <w:sz w:val="21"/>
+          <w:sz w:val="19"/>
         </w:rPr>
-        <w:t>Apabila pelunasan transaksi melewati batas waktu 3 minggu (21 hari) pasca reservasi, maka skema fee yang berlaku akan berbeda (disesuaikan kembali) dan akan disharekan lebih lanjut oleh manajemen. Selain itu, harga unit pada kondisi tersebut dapat dinegosiasikan.</w:t>
+        <w:t>Apabila pelunasan melewati batas waktu 3 minggu (21 hari) dari tanggal reservasi, maka besaran fee akan berbeda (disesuaikan kembali) serta harga unit dapat dinegosiasikan. Detail ketentuan terkait hal ini akan disharekan lebih lanjut oleh manajemen.</w:t>
       </w:r>
     </w:p>
     <w:p>
       <w:pPr>
-        <w:spacing w:before="80" w:after="40"/>
+        <w:spacing w:before="60" w:after="20"/>
       </w:pPr>
       <w:r>
         <w:rPr>
           <w:b/>
           <w:color w:val="1B365D"/>
-          <w:sz w:val="21"/>
+          <w:sz w:val="19"/>
         </w:rPr>
-        <w:t>5. Instruksi Manajemen: Manfaatkan &amp; Maksimalkan Team</w:t>
+        <w:t>5. Masa Berlaku Program:</w:t>
       </w:r>
     </w:p>
     <w:p>
       <w:pPr>
-        <w:spacing w:after="120"/>
-        <w:ind w:left="360"/>
+        <w:spacing w:after="80"/>
+        <w:ind w:left="288"/>
       </w:pPr>
       <w:r>
         <w:rPr>
-          <w:sz w:val="21"/>
+          <w:sz w:val="19"/>
         </w:rPr>
-        <w:t>Pihak manajemen menghimbau seluruh rekan sales marketing untuk segera merapatkan barisan, bergerak cepat mem-follow up calon buyer prospektif, serta memanfaatkan momentum golden period 21 hari ini secara maksimal guna mendongkrak pencapaian closing unit bersama.</w:t>
+        <w:t>Program ini mulai berlaku sejak tanggal memo ini diterbitkan. Terkait batas akhir berlakunya promo fee ini, nantinya akan diinfokan kembali oleh manajemen secara resmi (baik melalui grup WhatsApp, lisan, maupun pemberitahuan tertulis di kemudian hari).</w:t>
       </w:r>
     </w:p>
     <w:p>
       <w:pPr>
-        <w:spacing w:before="120" w:after="160"/>
+        <w:spacing w:before="80" w:after="80"/>
       </w:pPr>
       <w:r>
         <w:rPr>
-          <w:i/>
-          <w:sz w:val="21"/>
+          <w:b/>
+          <w:color w:val="0D5C75"/>
+          <w:sz w:val="20"/>
         </w:rPr>
-        <w:t>Kebijakan ini berlaku efektif sejak tanggal diterbitkan IOM ini.</w:t>
+        <w:t>Mari manfaatkan dan maksimalkan kesempatan ini bersama tim untuk kejar target closing sebanyak-banyaknya!</w:t>
       </w:r>
     </w:p>
     <w:p>
       <w:pPr>
-        <w:spacing w:after="400"/>
+        <w:spacing w:after="240"/>
       </w:pPr>
       <w:r>
         <w:rPr>
-          <w:sz w:val="21"/>
+          <w:sz w:val="19"/>
         </w:rPr>
-        <w:t>Demikian Internal Office Memo ini disampaikan untuk dapat dipedomani dan dilaksanakan dengan sebaik-baiknya.</w:t>
+        <w:t>Demikian memo ini disampaikan untuk dilaksanakan dengan sebaik-baiknya.</w:t>
       </w:r>
     </w:p>
     <w:tbl>
@@ -515,9 +516,9 @@
         <w:tblLook w:firstColumn="1" w:firstRow="1" w:lastColumn="0" w:lastRow="0" w:noHBand="0" w:noVBand="1" w:val="04A0"/>
       </w:tblPr>
       <w:tblGrid>
-        <w:gridCol w:w="3120"/>
-        <w:gridCol w:w="3120"/>
-        <w:gridCol w:w="3120"/>
+        <w:gridCol w:w="3202"/>
+        <w:gridCol w:w="3202"/>
+        <w:gridCol w:w="3202"/>
       </w:tblGrid>
       <w:tr>
         <w:tc>
@@ -526,12 +527,13 @@
           </w:tcPr>
           <w:p>
             <w:pPr>
+              <w:spacing w:after="0"/>
               <w:jc w:val="center"/>
             </w:pPr>
             <w:r>
               <w:rPr>
                 <w:b/>
-                <w:sz w:val="20"/>
+                <w:sz w:val="19"/>
               </w:rPr>
               <w:t>Disusun oleh,</w:t>
             </w:r>
@@ -543,12 +545,13 @@
           </w:tcPr>
           <w:p>
             <w:pPr>
+              <w:spacing w:after="0"/>
               <w:jc w:val="center"/>
             </w:pPr>
             <w:r>
               <w:rPr>
                 <w:b/>
-                <w:sz w:val="20"/>
+                <w:sz w:val="19"/>
               </w:rPr>
               <w:t>Disetujui oleh,</w:t>
             </w:r>
@@ -560,12 +563,13 @@
           </w:tcPr>
           <w:p>
             <w:pPr>
+              <w:spacing w:after="0"/>
               <w:jc w:val="center"/>
             </w:pPr>
             <w:r>
               <w:rPr>
                 <w:b/>
-                <w:sz w:val="20"/>
+                <w:sz w:val="19"/>
               </w:rPr>
               <w:t>Mengetahui,</w:t>
             </w:r>
@@ -574,7 +578,7 @@
       </w:tr>
       <w:tr>
         <w:trPr>
-          <w:trHeight w:val="1296"/>
+          <w:trHeight w:val="936"/>
         </w:trPr>
         <w:tc>
           <w:tcPr>
@@ -602,12 +606,13 @@
           </w:tcPr>
           <w:p>
             <w:pPr>
+              <w:spacing w:before="0" w:after="0"/>
               <w:jc w:val="center"/>
             </w:pPr>
             <w:r>
               <w:rPr>
                 <w:b/>
-                <w:sz w:val="21"/>
+                <w:sz w:val="19"/>
               </w:rPr>
               <w:t>(Nugi Fathul Falah)</w:t>
               <w:br/>
@@ -615,7 +620,7 @@
             <w:r>
               <w:rPr>
                 <w:color w:val="555555"/>
-                <w:sz w:val="18"/>
+                <w:sz w:val="17"/>
               </w:rPr>
               <w:t>SPV Markom dan Digital</w:t>
             </w:r>
@@ -627,12 +632,13 @@
           </w:tcPr>
           <w:p>
             <w:pPr>
+              <w:spacing w:before="0" w:after="0"/>
               <w:jc w:val="center"/>
             </w:pPr>
             <w:r>
               <w:rPr>
                 <w:b/>
-                <w:sz w:val="21"/>
+                <w:sz w:val="19"/>
               </w:rPr>
               <w:t>(Arie)</w:t>
               <w:br/>
@@ -640,7 +646,7 @@
             <w:r>
               <w:rPr>
                 <w:color w:val="555555"/>
-                <w:sz w:val="18"/>
+                <w:sz w:val="17"/>
               </w:rPr>
               <w:t>HRD &amp; General Affairs</w:t>
             </w:r>
@@ -652,12 +658,13 @@
           </w:tcPr>
           <w:p>
             <w:pPr>
+              <w:spacing w:before="0" w:after="0"/>
               <w:jc w:val="center"/>
             </w:pPr>
             <w:r>
               <w:rPr>
                 <w:b/>
-                <w:sz w:val="21"/>
+                <w:sz w:val="19"/>
               </w:rPr>
               <w:t>(Yana Priatna)</w:t>
               <w:br/>
@@ -665,7 +672,7 @@
             <w:r>
               <w:rPr>
                 <w:color w:val="555555"/>
-                <w:sz w:val="18"/>
+                <w:sz w:val="17"/>
               </w:rPr>
               <w:t>Direktur Utama / CEO &amp; Founder</w:t>
             </w:r>
@@ -674,8 +681,8 @@
       </w:tr>
     </w:tbl>
     <w:sectPr>
-      <w:pgSz w:w="12240" w:h="15840"/>
-      <w:pgMar w:top="1152" w:right="1440" w:bottom="1152" w:left="1440" w:header="720" w:footer="720" w:gutter="0"/>
+      <w:pgSz w:w="11909" w:h="16834"/>
+      <w:pgMar w:top="792" w:right="1152" w:bottom="792" w:left="1152" w:header="720" w:footer="720" w:gutter="0"/>
       <w:cols w:space="720"/>
       <w:docGrid w:linePitch="360"/>
     </w:sectPr>
@@ -1049,7 +1056,7 @@
     <w:rPr>
       <w:rFonts w:ascii="Calibri" w:hAnsi="Calibri"/>
       <w:color w:val="222222"/>
-      <w:sz w:val="22"/>
+      <w:sz w:val="20"/>
     </w:rPr>
   </w:style>
   <w:style w:type="paragraph" w:styleId="Header">

</xml_diff>